<commit_message>
Publish revision4: Table C2 highlighted in revised-paper DOCX
</commit_message>
<xml_diff>
--- a/revision4/paper_round2.docx
+++ b/revision4/paper_round2.docx
@@ -22584,61 +22584,98 @@
         <w:rPr>
           <w:b/>
           <w:bCs/>
+          <w:highlight w:val="yellow"/>
         </w:rPr>
         <w:t xml:space="preserve">Table C2.</w:t>
       </w:r>
       <w:r>
-        <w:t xml:space="preserve"> </w:t>
-      </w:r>
-      <w:r>
+        <w:rPr>
+          <w:highlight w:val="yellow"/>
+        </w:rPr>
+        <w:t xml:space="preserve"> </w:t>
+      </w:r>
+      <w:r>
+        <w:rPr>
+          <w:highlight w:val="yellow"/>
+        </w:rPr>
         <w:t xml:space="preserve">Alignment of the correlation communities with the documented physical stages.</w:t>
       </w:r>
       <w:r>
+        <w:rPr>
+          <w:highlight w:val="yellow"/>
+        </w:rPr>
         <w:t xml:space="preserve"> </w:t>
       </w:r>
       <w:r>
         <w:rPr>
           <w:i/>
           <w:iCs/>
+          <w:highlight w:val="yellow"/>
         </w:rPr>
         <w:t xml:space="preserve">Stage purity</w:t>
       </w:r>
       <w:r>
-        <w:t xml:space="preserve"> </w:t>
-      </w:r>
-      <w:r>
+        <w:rPr>
+          <w:highlight w:val="yellow"/>
+        </w:rPr>
+        <w:t xml:space="preserve"> </w:t>
+      </w:r>
+      <w:r>
+        <w:rPr>
+          <w:highlight w:val="yellow"/>
+        </w:rPr>
         <w:t xml:space="preserve">is the size-weighted fraction of channels lying in their community's dominant stage;</w:t>
       </w:r>
       <w:r>
+        <w:rPr>
+          <w:highlight w:val="yellow"/>
+        </w:rPr>
         <w:t xml:space="preserve"> </w:t>
       </w:r>
       <w:r>
         <w:rPr>
           <w:i/>
           <w:iCs/>
+          <w:highlight w:val="yellow"/>
         </w:rPr>
         <w:t xml:space="preserve">null</w:t>
       </w:r>
       <w:r>
-        <w:t xml:space="preserve"> </w:t>
-      </w:r>
-      <w:r>
+        <w:rPr>
+          <w:highlight w:val="yellow"/>
+        </w:rPr>
+        <w:t xml:space="preserve"> </w:t>
+      </w:r>
+      <w:r>
+        <w:rPr>
+          <w:highlight w:val="yellow"/>
+        </w:rPr>
         <w:t xml:space="preserve">is its mean under 2,000 random label permutations (the observed value exceeds the null's 95th percentile in both cases).</w:t>
       </w:r>
       <w:r>
+        <w:rPr>
+          <w:highlight w:val="yellow"/>
+        </w:rPr>
         <w:t xml:space="preserve"> </w:t>
       </w:r>
       <w:r>
         <w:rPr>
           <w:i/>
           <w:iCs/>
+          <w:highlight w:val="yellow"/>
         </w:rPr>
         <w:t xml:space="preserve">Pure</w:t>
       </w:r>
       <w:r>
-        <w:t xml:space="preserve"> </w:t>
-      </w:r>
-      <w:r>
+        <w:rPr>
+          <w:highlight w:val="yellow"/>
+        </w:rPr>
+        <w:t xml:space="preserve"> </w:t>
+      </w:r>
+      <w:r>
+        <w:rPr>
+          <w:highlight w:val="yellow"/>
+        </w:rPr>
         <w:t xml:space="preserve">is the share of communities entirely within one stage. On SWaT, whose six stages are balanced, a flat cut of the same dendrogram at six clusters also gives normalized mutual information 0.465 and homogeneity 0.436 against the stages; on WADI a single process area dominates the channel count, so a partition-agreement score is uninformative there and the purity-versus-null comparison is the appropriate measure.</w:t>
       </w:r>
     </w:p>
@@ -22686,6 +22723,7 @@
                 <w:b/>
                 <w:sz w:val="18"/>
                 <w:szCs w:val="18"/>
+                <w:highlight w:val="yellow"/>
               </w:rPr>
               <w:t xml:space="preserve">Dataset</w:t>
             </w:r>
@@ -22709,6 +22747,7 @@
                 <w:b/>
                 <w:sz w:val="18"/>
                 <w:szCs w:val="18"/>
+                <w:highlight w:val="yellow"/>
               </w:rPr>
               <w:t xml:space="preserve">Active channels</w:t>
             </w:r>
@@ -22732,6 +22771,7 @@
                 <w:b/>
                 <w:sz w:val="18"/>
                 <w:szCs w:val="18"/>
+                <w:highlight w:val="yellow"/>
               </w:rPr>
               <w:t xml:space="preserve">Documented stages</w:t>
             </w:r>
@@ -22755,6 +22795,7 @@
                 <w:b/>
                 <w:sz w:val="18"/>
                 <w:szCs w:val="18"/>
+                <w:highlight w:val="yellow"/>
               </w:rPr>
               <w:t xml:space="preserve">Communities</w:t>
             </w:r>
@@ -22778,6 +22819,7 @@
                 <w:b/>
                 <w:sz w:val="18"/>
                 <w:szCs w:val="18"/>
+                <w:highlight w:val="yellow"/>
               </w:rPr>
               <w:t xml:space="preserve">Stage purity</w:t>
             </w:r>
@@ -22801,6 +22843,7 @@
                 <w:b/>
                 <w:sz w:val="18"/>
                 <w:szCs w:val="18"/>
+                <w:highlight w:val="yellow"/>
               </w:rPr>
               <w:t xml:space="preserve">Permutation null</w:t>
             </w:r>
@@ -22824,6 +22867,7 @@
                 <w:b/>
                 <w:sz w:val="18"/>
                 <w:szCs w:val="18"/>
+                <w:highlight w:val="yellow"/>
               </w:rPr>
               <w:t xml:space="preserve">Stage-pure</w:t>
             </w:r>
@@ -22845,6 +22889,7 @@
               <w:rPr>
                 <w:sz w:val="18"/>
                 <w:szCs w:val="18"/>
+                <w:highlight w:val="yellow"/>
               </w:rPr>
               <w:t xml:space="preserve">SWaT</w:t>
             </w:r>
@@ -22864,6 +22909,7 @@
               <w:rPr>
                 <w:sz w:val="18"/>
                 <w:szCs w:val="18"/>
+                <w:highlight w:val="yellow"/>
               </w:rPr>
               <w:t xml:space="preserve">43</w:t>
             </w:r>
@@ -22883,6 +22929,7 @@
               <w:rPr>
                 <w:sz w:val="18"/>
                 <w:szCs w:val="18"/>
+                <w:highlight w:val="yellow"/>
               </w:rPr>
               <w:t xml:space="preserve">6</w:t>
             </w:r>
@@ -22902,6 +22949,7 @@
               <w:rPr>
                 <w:sz w:val="18"/>
                 <w:szCs w:val="18"/>
+                <w:highlight w:val="yellow"/>
               </w:rPr>
               <w:t xml:space="preserve">26</w:t>
             </w:r>
@@ -22921,6 +22969,7 @@
               <w:rPr>
                 <w:sz w:val="18"/>
                 <w:szCs w:val="18"/>
+                <w:highlight w:val="yellow"/>
               </w:rPr>
               <w:t xml:space="preserve">0.578</w:t>
             </w:r>
@@ -22940,6 +22989,7 @@
               <w:rPr>
                 <w:sz w:val="18"/>
                 <w:szCs w:val="18"/>
+                <w:highlight w:val="yellow"/>
               </w:rPr>
               <w:t xml:space="preserve">0.370</w:t>
             </w:r>
@@ -22959,6 +23009,7 @@
               <w:rPr>
                 <w:sz w:val="18"/>
                 <w:szCs w:val="18"/>
+                <w:highlight w:val="yellow"/>
               </w:rPr>
               <w:t xml:space="preserve">12%</w:t>
             </w:r>
@@ -22980,6 +23031,7 @@
               <w:rPr>
                 <w:sz w:val="18"/>
                 <w:szCs w:val="18"/>
+                <w:highlight w:val="yellow"/>
               </w:rPr>
               <w:t xml:space="preserve">WADI</w:t>
             </w:r>
@@ -22999,6 +23051,7 @@
               <w:rPr>
                 <w:sz w:val="18"/>
                 <w:szCs w:val="18"/>
+                <w:highlight w:val="yellow"/>
               </w:rPr>
               <w:t xml:space="preserve">91</w:t>
             </w:r>
@@ -23018,6 +23071,7 @@
               <w:rPr>
                 <w:sz w:val="18"/>
                 <w:szCs w:val="18"/>
+                <w:highlight w:val="yellow"/>
               </w:rPr>
               <w:t xml:space="preserve">3</w:t>
             </w:r>
@@ -23037,6 +23091,7 @@
               <w:rPr>
                 <w:sz w:val="18"/>
                 <w:szCs w:val="18"/>
+                <w:highlight w:val="yellow"/>
               </w:rPr>
               <w:t xml:space="preserve">44</w:t>
             </w:r>
@@ -23056,6 +23111,7 @@
               <w:rPr>
                 <w:sz w:val="18"/>
                 <w:szCs w:val="18"/>
+                <w:highlight w:val="yellow"/>
               </w:rPr>
               <w:t xml:space="preserve">0.904</w:t>
             </w:r>
@@ -23075,6 +23131,7 @@
               <w:rPr>
                 <w:sz w:val="18"/>
                 <w:szCs w:val="18"/>
+                <w:highlight w:val="yellow"/>
               </w:rPr>
               <w:t xml:space="preserve">0.795</w:t>
             </w:r>
@@ -23094,6 +23151,7 @@
               <w:rPr>
                 <w:sz w:val="18"/>
                 <w:szCs w:val="18"/>
+                <w:highlight w:val="yellow"/>
               </w:rPr>
               <w:t xml:space="preserve">68%</w:t>
             </w:r>

</xml_diff>